<commit_message>
Carta: frase del cuerpo coherente y columnas equilibradas
- Decia: INMEDIATA 'Solicitud de adquisicion "ADQUISICION DE X' -> repetia
  'adquisicion' y dejaba tres comillas abiertas. Ahora: INMEDIATA la
  'ADQUISICION DE X', con el articulo concordado (el 'SERVICIO DE ...') y las
  comillas balanceadas. La denominacion va en negrita.
- La columna DESCRIPCION se quedaba corta y partia el texto en tres lineas
  mientras CODIGO SIGA y CANTIDAD sobraban ancho; se repartieron de nuevo.

Co-Authored-By: Claude Opus 5 <noreply@anthropic.com>
Claude-Session: https://claude.ai/code/session_01S69ej8Vgbpjdhn84ABgydA
</commit_message>
<xml_diff>
--- a/plantilla/CARTA_URGENTE.docx
+++ b/plantilla/CARTA_URGENTE.docx
@@ -587,11 +587,20 @@
           <w:sz w:val="18"/>
           <w:szCs w:val="18"/>
         </w:rPr>
-        <w:t xml:space="preserve">INMEDIATA “Solicitud de adquisición “</w:t>
-      </w:r>
-      <w:r>
-        <w:rPr>
-          <w:rFonts w:ascii="Arial" w:hAnsi="Arial" w:cs="Arial"/>
+        <w:t xml:space="preserve">INMEDIATA</w:t>
+      </w:r>
+      <w:r>
+        <w:rPr>
+          <w:rFonts w:ascii="Arial" w:hAnsi="Arial" w:cs="Arial"/>
+          <w:sz w:val="18"/>
+          <w:szCs w:val="18"/>
+        </w:rPr>
+        <w:t xml:space="preserve"> {articulo} “</w:t>
+      </w:r>
+      <w:r>
+        <w:rPr>
+          <w:rFonts w:ascii="Arial" w:hAnsi="Arial" w:cs="Arial"/>
+          <w:b/>
           <w:sz w:val="18"/>
           <w:szCs w:val="18"/>
         </w:rPr>
@@ -630,17 +639,17 @@
         </w:tblBorders>
       </w:tblPr>
       <w:tblGrid>
-        <w:gridCol w:w="1689"/>
-        <w:gridCol w:w="2071"/>
-        <w:gridCol w:w="1231"/>
-        <w:gridCol w:w="1006"/>
-        <w:gridCol w:w="1253"/>
-        <w:gridCol w:w="1254"/>
+        <w:gridCol w:w="1500"/>
+        <w:gridCol w:w="2704"/>
+        <w:gridCol w:w="900"/>
+        <w:gridCol w:w="1100"/>
+        <w:gridCol w:w="1150"/>
+        <w:gridCol w:w="1150"/>
       </w:tblGrid>
       <w:tr>
         <w:tc>
           <w:tcPr>
-            <w:tcW w:w="1689" w:type="dxa"/>
+            <w:tcW w:w="1500" w:type="dxa"/>
             <w:shd w:val="clear" w:color="auto" w:fill="BDD6EE"/>
             <w:vAlign w:val="center"/>
           </w:tcPr>
@@ -668,7 +677,7 @@
         </w:tc>
         <w:tc>
           <w:tcPr>
-            <w:tcW w:w="2071" w:type="dxa"/>
+            <w:tcW w:w="2704" w:type="dxa"/>
             <w:shd w:val="clear" w:color="auto" w:fill="BDD6EE"/>
             <w:vAlign w:val="center"/>
           </w:tcPr>
@@ -696,7 +705,7 @@
         </w:tc>
         <w:tc>
           <w:tcPr>
-            <w:tcW w:w="1231" w:type="dxa"/>
+            <w:tcW w:w="900" w:type="dxa"/>
             <w:shd w:val="clear" w:color="auto" w:fill="BDD6EE"/>
             <w:vAlign w:val="center"/>
           </w:tcPr>
@@ -724,7 +733,7 @@
         </w:tc>
         <w:tc>
           <w:tcPr>
-            <w:tcW w:w="1006" w:type="dxa"/>
+            <w:tcW w:w="1100" w:type="dxa"/>
             <w:shd w:val="clear" w:color="auto" w:fill="BDD6EE"/>
             <w:vAlign w:val="center"/>
           </w:tcPr>
@@ -752,7 +761,7 @@
         </w:tc>
         <w:tc>
           <w:tcPr>
-            <w:tcW w:w="1253" w:type="dxa"/>
+            <w:tcW w:w="1150" w:type="dxa"/>
             <w:shd w:val="clear" w:color="auto" w:fill="BDD6EE"/>
             <w:vAlign w:val="center"/>
           </w:tcPr>
@@ -780,7 +789,7 @@
         </w:tc>
         <w:tc>
           <w:tcPr>
-            <w:tcW w:w="1254" w:type="dxa"/>
+            <w:tcW w:w="1150" w:type="dxa"/>
             <w:shd w:val="clear" w:color="auto" w:fill="BDD6EE"/>
             <w:vAlign w:val="center"/>
           </w:tcPr>
@@ -810,7 +819,7 @@
       <w:tr>
         <w:tc>
           <w:tcPr>
-            <w:tcW w:w="1689" w:type="dxa"/>
+            <w:tcW w:w="1500" w:type="dxa"/>
             <w:vAlign w:val="center"/>
           </w:tcPr>
           <w:p>
@@ -835,7 +844,7 @@
         </w:tc>
         <w:tc>
           <w:tcPr>
-            <w:tcW w:w="2071" w:type="dxa"/>
+            <w:tcW w:w="2704" w:type="dxa"/>
             <w:vAlign w:val="center"/>
           </w:tcPr>
           <w:p>
@@ -860,7 +869,7 @@
         </w:tc>
         <w:tc>
           <w:tcPr>
-            <w:tcW w:w="1231" w:type="dxa"/>
+            <w:tcW w:w="900" w:type="dxa"/>
             <w:vAlign w:val="center"/>
           </w:tcPr>
           <w:p>
@@ -885,7 +894,7 @@
         </w:tc>
         <w:tc>
           <w:tcPr>
-            <w:tcW w:w="1006" w:type="dxa"/>
+            <w:tcW w:w="1100" w:type="dxa"/>
             <w:vAlign w:val="center"/>
           </w:tcPr>
           <w:p>
@@ -910,7 +919,7 @@
         </w:tc>
         <w:tc>
           <w:tcPr>
-            <w:tcW w:w="1253" w:type="dxa"/>
+            <w:tcW w:w="1150" w:type="dxa"/>
             <w:vAlign w:val="center"/>
           </w:tcPr>
           <w:p>
@@ -935,7 +944,7 @@
         </w:tc>
         <w:tc>
           <w:tcPr>
-            <w:tcW w:w="1254" w:type="dxa"/>
+            <w:tcW w:w="1150" w:type="dxa"/>
             <w:vAlign w:val="center"/>
           </w:tcPr>
           <w:p>
@@ -962,7 +971,7 @@
       <w:tr>
         <w:tc>
           <w:tcPr>
-            <w:tcW w:w="7250" w:type="dxa"/>
+            <w:tcW w:w="7354" w:type="dxa"/>
             <w:gridSpan w:val="5"/>
             <w:vAlign w:val="center"/>
           </w:tcPr>
@@ -990,7 +999,7 @@
         </w:tc>
         <w:tc>
           <w:tcPr>
-            <w:tcW w:w="1254" w:type="dxa"/>
+            <w:tcW w:w="1150" w:type="dxa"/>
             <w:vAlign w:val="center"/>
           </w:tcPr>
           <w:p>

</xml_diff>